<commit_message>
chore: update project analyzer workflow outputs v4.3
</commit_message>
<xml_diff>
--- a/outputs/projects/project_report_bib_report.docx
+++ b/outputs/projects/project_report_bib_report.docx
@@ -17,7 +17,7 @@
     </w:p>
     <w:p>
       <w:r>
-        <w:t xml:space="preserve">Automatisch gegenereerd: 2026-06-27T11:42:59</w:t>
+        <w:t xml:space="preserve">Automatisch gegenereerd: 2026-06-27T12:58:02</w:t>
       </w:r>
     </w:p>
     <w:p>
@@ -73,7 +73,7 @@
     </w:p>
     <w:p>
       <w:r>
-        <w:t xml:space="preserve">• project_name: Default Project Phoenix Report</w:t>
+        <w:t xml:space="preserve">• project_name: Default Project Phoenix Analyzer Workflow</w:t>
       </w:r>
     </w:p>
     <w:p>
@@ -83,12 +83,7 @@
     </w:p>
     <w:p>
       <w:r>
-        <w:t xml:space="preserve">• purpose: Automatisch projectrapport-startpakket vanuit BIB.</w:t>
-      </w:r>
-    </w:p>
-    <w:p>
-      <w:r>
-        <w:t xml:space="preserve">• location: nog niet opgegeven</w:t>
+        <w:t xml:space="preserve">• purpose: Volledige BAOEES projectanalyse via BIB, AAIE, Geo/Foundation en rapportexport.</w:t>
       </w:r>
     </w:p>
     <w:p>

</xml_diff>

<commit_message>
feat: connect evidence package to analyzer workflow v4.6
</commit_message>
<xml_diff>
--- a/outputs/projects/project_report_bib_report.docx
+++ b/outputs/projects/project_report_bib_report.docx
@@ -17,7 +17,7 @@
     </w:p>
     <w:p>
       <w:r>
-        <w:t xml:space="preserve">Automatisch gegenereerd: 2026-06-27T12:58:02</w:t>
+        <w:t xml:space="preserve">Automatisch gegenereerd: 2026-06-27T15:42:10</w:t>
       </w:r>
     </w:p>
     <w:p>
@@ -73,7 +73,7 @@
     </w:p>
     <w:p>
       <w:r>
-        <w:t xml:space="preserve">• project_name: Default Project Phoenix Analyzer Workflow</w:t>
+        <w:t xml:space="preserve">• project_name: Default Project Phoenix Report</w:t>
       </w:r>
     </w:p>
     <w:p>
@@ -83,7 +83,12 @@
     </w:p>
     <w:p>
       <w:r>
-        <w:t xml:space="preserve">• purpose: Volledige BAOEES projectanalyse via BIB, AAIE, Geo/Foundation en rapportexport.</w:t>
+        <w:t xml:space="preserve">• purpose: Automatisch projectrapport-startpakket vanuit BIB.</w:t>
+      </w:r>
+    </w:p>
+    <w:p>
+      <w:r>
+        <w:t xml:space="preserve">• location: nog niet opgegeven</w:t>
       </w:r>
     </w:p>
     <w:p>

</xml_diff>